<commit_message>
Add battery platform interface spec and refresh planning docs
</commit_message>
<xml_diff>
--- a/doc/human/SB-00_Document_Index_v1_1.docx
+++ b/doc/human/SB-00_Document_Index_v1_1.docx
@@ -818,6 +818,72 @@
           </w:p>
         </w:tc>
       </w:tr>
+      <w:tr>
+        <w:tc>
+          <w:tcPr>
+            <w:tcW w:type="dxa" w:w="2256"/>
+          </w:tcPr>
+          <w:p>
+            <w:r>
+              <w:rPr>
+                <w:rFonts w:ascii="TH Sarabun New" w:hAnsi="TH Sarabun New" w:eastAsia="TH Sarabun New" w:cs="TH Sarabun New"/>
+                <w:b w:val="0"/>
+                <w:i w:val="0"/>
+                <w:sz w:val="32"/>
+              </w:rPr>
+              <w:t>10</w:t>
+            </w:r>
+          </w:p>
+        </w:tc>
+        <w:tc>
+          <w:tcPr>
+            <w:tcW w:type="dxa" w:w="2256"/>
+          </w:tcPr>
+          <w:p>
+            <w:r>
+              <w:rPr>
+                <w:rFonts w:ascii="TH Sarabun New" w:hAnsi="TH Sarabun New" w:eastAsia="TH Sarabun New" w:cs="TH Sarabun New"/>
+                <w:b w:val="0"/>
+                <w:i w:val="0"/>
+                <w:sz w:val="32"/>
+              </w:rPr>
+              <w:t>SB-00 - Battery Platform Interface Spec</w:t>
+            </w:r>
+          </w:p>
+        </w:tc>
+        <w:tc>
+          <w:tcPr>
+            <w:tcW w:type="dxa" w:w="2256"/>
+          </w:tcPr>
+          <w:p>
+            <w:r>
+              <w:rPr>
+                <w:rFonts w:ascii="TH Sarabun New" w:hAnsi="TH Sarabun New" w:eastAsia="TH Sarabun New" w:cs="TH Sarabun New"/>
+                <w:b w:val="0"/>
+                <w:i w:val="0"/>
+                <w:sz w:val="32"/>
+              </w:rPr>
+              <w:t>Version 1.0 | April 2026 | Working interface spec for EX-08A | Last synced: 2026-04-03</w:t>
+            </w:r>
+          </w:p>
+        </w:tc>
+        <w:tc>
+          <w:tcPr>
+            <w:tcW w:type="dxa" w:w="2256"/>
+          </w:tcPr>
+          <w:p>
+            <w:r>
+              <w:rPr>
+                <w:rFonts w:ascii="TH Sarabun New" w:hAnsi="TH Sarabun New" w:eastAsia="TH Sarabun New" w:cs="TH Sarabun New"/>
+                <w:b w:val="0"/>
+                <w:i w:val="0"/>
+                <w:sz w:val="32"/>
+              </w:rPr>
+              <w:t>SB-00_Battery_Platform_Interface_Spec_v1_0.docx</w:t>
+            </w:r>
+          </w:p>
+        </w:tc>
+      </w:tr>
     </w:tbl>
     <w:p/>
     <w:p>

</xml_diff>

<commit_message>
Consolidate human docs into grouped guides
</commit_message>
<xml_diff>
--- a/doc/human/SB-00_Document_Index_v1_1.docx
+++ b/doc/human/SB-00_Document_Index_v1_1.docx
@@ -253,7 +253,7 @@
                 <w:i w:val="0"/>
                 <w:sz w:val="32"/>
               </w:rPr>
-              <w:t>SB-00 - Master Assumptions</w:t>
+              <w:t>SB-00 - Start Here</w:t>
             </w:r>
           </w:p>
         </w:tc>
@@ -269,7 +269,7 @@
                 <w:i w:val="0"/>
                 <w:sz w:val="32"/>
               </w:rPr>
-              <w:t>Version 1.1 | April 2026 | Canonical baseline for all SB-00 v1.1 documents | Last synced: 2026-04-02</w:t>
+              <w:t>Version 1.0 | April 2026 | Human-friendly entry point | Last synced: 2026-04-03</w:t>
             </w:r>
           </w:p>
         </w:tc>
@@ -285,7 +285,7 @@
                 <w:i w:val="0"/>
                 <w:sz w:val="32"/>
               </w:rPr>
-              <w:t>SB-00_Master_Assumptions_v1_1.docx</w:t>
+              <w:t>HB-01_Start_Here_v1_0.docx</w:t>
             </w:r>
           </w:p>
         </w:tc>
@@ -319,7 +319,7 @@
                 <w:i w:val="0"/>
                 <w:sz w:val="32"/>
               </w:rPr>
-              <w:t>SB-00 - Decision Register</w:t>
+              <w:t>SB-00 - Action Plan</w:t>
             </w:r>
           </w:p>
         </w:tc>
@@ -335,7 +335,7 @@
                 <w:i w:val="0"/>
                 <w:sz w:val="32"/>
               </w:rPr>
-              <w:t>Version 1.1 | April 2026 | Meeting-ready decisions for SB-00 v1.1 | Last synced: 2026-04-02</w:t>
+              <w:t>Version 1.0 | April 2026 | Human-friendly execution view | Last synced: 2026-04-03</w:t>
             </w:r>
           </w:p>
         </w:tc>
@@ -351,7 +351,7 @@
                 <w:i w:val="0"/>
                 <w:sz w:val="32"/>
               </w:rPr>
-              <w:t>SB-00_Decision_Register_v1_1.docx</w:t>
+              <w:t>HB-02_Action_Plan_v1_0.docx</w:t>
             </w:r>
           </w:p>
         </w:tc>
@@ -385,7 +385,7 @@
                 <w:i w:val="0"/>
                 <w:sz w:val="32"/>
               </w:rPr>
-              <w:t>SB-00 - Execution Task List</w:t>
+              <w:t>SB-00 - System Design</w:t>
             </w:r>
           </w:p>
         </w:tc>
@@ -401,7 +401,7 @@
                 <w:i w:val="0"/>
                 <w:sz w:val="32"/>
               </w:rPr>
-              <w:t>Version 1.1 | April 2026 | Ready-to-execute task list derived from locked baseline | Last synced: 2026-04-02</w:t>
+              <w:t>Version 1.0 | April 2026 | Human-friendly system overview | Last synced: 2026-04-03</w:t>
             </w:r>
           </w:p>
         </w:tc>
@@ -417,7 +417,7 @@
                 <w:i w:val="0"/>
                 <w:sz w:val="32"/>
               </w:rPr>
-              <w:t>SB-00_Execution_Task_List_v1_1.docx</w:t>
+              <w:t>HB-03_System_Design_v1_0.docx</w:t>
             </w:r>
           </w:p>
         </w:tc>
@@ -451,7 +451,7 @@
                 <w:i w:val="0"/>
                 <w:sz w:val="32"/>
               </w:rPr>
-              <w:t>SB-00 - Third-Party Pricing Baseline</w:t>
+              <w:t>SB-00 - Cost And Procurement</w:t>
             </w:r>
           </w:p>
         </w:tc>
@@ -467,7 +467,7 @@
                 <w:i w:val="0"/>
                 <w:sz w:val="32"/>
               </w:rPr>
-              <w:t>Version 1.1 | April 2026 | Canonical service pricing/limits baseline for SB-00 v1.1 | Last synced: 2026-04-02</w:t>
+              <w:t>Version 1.0 | April 2026 | Human-friendly cost and buying view | Last synced: 2026-04-03</w:t>
             </w:r>
           </w:p>
         </w:tc>
@@ -483,7 +483,7 @@
                 <w:i w:val="0"/>
                 <w:sz w:val="32"/>
               </w:rPr>
-              <w:t>SB-00_Third_Party_Pricing_Baseline_v1_1.docx</w:t>
+              <w:t>HB-04_Cost_And_Procurement_v1_0.docx</w:t>
             </w:r>
           </w:p>
         </w:tc>
@@ -517,7 +517,7 @@
                 <w:i w:val="0"/>
                 <w:sz w:val="32"/>
               </w:rPr>
-              <w:t>SB-00 - Development Plan Summary</w:t>
+              <w:t>SB-00 - Business And Launch</w:t>
             </w:r>
           </w:p>
         </w:tc>
@@ -533,7 +533,7 @@
                 <w:i w:val="0"/>
                 <w:sz w:val="32"/>
               </w:rPr>
-              <w:t>Version 1.1 | March 2026 | ใช้ประกอบกับ SB-00BusinessRoadmapv11.md</w:t>
+              <w:t>Version 1.0 | April 2026 | Human-friendly business and launch view | Last synced: 2026-04-03</w:t>
             </w:r>
           </w:p>
         </w:tc>
@@ -549,337 +549,7 @@
                 <w:i w:val="0"/>
                 <w:sz w:val="32"/>
               </w:rPr>
-              <w:t>SB-00_Dev_Plan_Summary_v1_1.docx</w:t>
-            </w:r>
-          </w:p>
-        </w:tc>
-      </w:tr>
-      <w:tr>
-        <w:tc>
-          <w:tcPr>
-            <w:tcW w:type="dxa" w:w="2256"/>
-          </w:tcPr>
-          <w:p>
-            <w:r>
-              <w:rPr>
-                <w:rFonts w:ascii="TH Sarabun New" w:hAnsi="TH Sarabun New" w:eastAsia="TH Sarabun New" w:cs="TH Sarabun New"/>
-                <w:b w:val="0"/>
-                <w:i w:val="0"/>
-                <w:sz w:val="32"/>
-              </w:rPr>
-              <w:t>6</w:t>
-            </w:r>
-          </w:p>
-        </w:tc>
-        <w:tc>
-          <w:tcPr>
-            <w:tcW w:type="dxa" w:w="2256"/>
-          </w:tcPr>
-          <w:p>
-            <w:r>
-              <w:rPr>
-                <w:rFonts w:ascii="TH Sarabun New" w:hAnsi="TH Sarabun New" w:eastAsia="TH Sarabun New" w:cs="TH Sarabun New"/>
-                <w:b w:val="0"/>
-                <w:i w:val="0"/>
-                <w:sz w:val="32"/>
-              </w:rPr>
-              <w:t>SB-00 AquaSense IoT - Business &amp; Roadmap</w:t>
-            </w:r>
-          </w:p>
-        </w:tc>
-        <w:tc>
-          <w:tcPr>
-            <w:tcW w:type="dxa" w:w="2256"/>
-          </w:tcPr>
-          <w:p>
-            <w:r>
-              <w:rPr>
-                <w:rFonts w:ascii="TH Sarabun New" w:hAnsi="TH Sarabun New" w:eastAsia="TH Sarabun New" w:cs="TH Sarabun New"/>
-                <w:b w:val="0"/>
-                <w:i w:val="0"/>
-                <w:sz w:val="32"/>
-              </w:rPr>
-              <w:t>Version 1.1 | March 2026 | Confidential</w:t>
-            </w:r>
-          </w:p>
-        </w:tc>
-        <w:tc>
-          <w:tcPr>
-            <w:tcW w:type="dxa" w:w="2256"/>
-          </w:tcPr>
-          <w:p>
-            <w:r>
-              <w:rPr>
-                <w:rFonts w:ascii="TH Sarabun New" w:hAnsi="TH Sarabun New" w:eastAsia="TH Sarabun New" w:cs="TH Sarabun New"/>
-                <w:b w:val="0"/>
-                <w:i w:val="0"/>
-                <w:sz w:val="32"/>
-              </w:rPr>
-              <w:t>SB-00_Business_Roadmap_v1_1.docx</w:t>
-            </w:r>
-          </w:p>
-        </w:tc>
-      </w:tr>
-      <w:tr>
-        <w:tc>
-          <w:tcPr>
-            <w:tcW w:type="dxa" w:w="2256"/>
-          </w:tcPr>
-          <w:p>
-            <w:r>
-              <w:rPr>
-                <w:rFonts w:ascii="TH Sarabun New" w:hAnsi="TH Sarabun New" w:eastAsia="TH Sarabun New" w:cs="TH Sarabun New"/>
-                <w:b w:val="0"/>
-                <w:i w:val="0"/>
-                <w:sz w:val="32"/>
-              </w:rPr>
-              <w:t>7</w:t>
-            </w:r>
-          </w:p>
-        </w:tc>
-        <w:tc>
-          <w:tcPr>
-            <w:tcW w:type="dxa" w:w="2256"/>
-          </w:tcPr>
-          <w:p>
-            <w:r>
-              <w:rPr>
-                <w:rFonts w:ascii="TH Sarabun New" w:hAnsi="TH Sarabun New" w:eastAsia="TH Sarabun New" w:cs="TH Sarabun New"/>
-                <w:b w:val="0"/>
-                <w:i w:val="0"/>
-                <w:sz w:val="32"/>
-              </w:rPr>
-              <w:t>SB-00 AquaSense IoT - Backend &amp; Security</w:t>
-            </w:r>
-          </w:p>
-        </w:tc>
-        <w:tc>
-          <w:tcPr>
-            <w:tcW w:type="dxa" w:w="2256"/>
-          </w:tcPr>
-          <w:p>
-            <w:r>
-              <w:rPr>
-                <w:rFonts w:ascii="TH Sarabun New" w:hAnsi="TH Sarabun New" w:eastAsia="TH Sarabun New" w:cs="TH Sarabun New"/>
-                <w:b w:val="0"/>
-                <w:i w:val="0"/>
-                <w:sz w:val="32"/>
-              </w:rPr>
-              <w:t>Version 1.1 | March 2026 | Confidential</w:t>
-            </w:r>
-          </w:p>
-        </w:tc>
-        <w:tc>
-          <w:tcPr>
-            <w:tcW w:type="dxa" w:w="2256"/>
-          </w:tcPr>
-          <w:p>
-            <w:r>
-              <w:rPr>
-                <w:rFonts w:ascii="TH Sarabun New" w:hAnsi="TH Sarabun New" w:eastAsia="TH Sarabun New" w:cs="TH Sarabun New"/>
-                <w:b w:val="0"/>
-                <w:i w:val="0"/>
-                <w:sz w:val="32"/>
-              </w:rPr>
-              <w:t>SB-00_Backend_Security_v1_1.docx</w:t>
-            </w:r>
-          </w:p>
-        </w:tc>
-      </w:tr>
-      <w:tr>
-        <w:tc>
-          <w:tcPr>
-            <w:tcW w:type="dxa" w:w="2256"/>
-          </w:tcPr>
-          <w:p>
-            <w:r>
-              <w:rPr>
-                <w:rFonts w:ascii="TH Sarabun New" w:hAnsi="TH Sarabun New" w:eastAsia="TH Sarabun New" w:cs="TH Sarabun New"/>
-                <w:b w:val="0"/>
-                <w:i w:val="0"/>
-                <w:sz w:val="32"/>
-              </w:rPr>
-              <w:t>8</w:t>
-            </w:r>
-          </w:p>
-        </w:tc>
-        <w:tc>
-          <w:tcPr>
-            <w:tcW w:type="dxa" w:w="2256"/>
-          </w:tcPr>
-          <w:p>
-            <w:r>
-              <w:rPr>
-                <w:rFonts w:ascii="TH Sarabun New" w:hAnsi="TH Sarabun New" w:eastAsia="TH Sarabun New" w:cs="TH Sarabun New"/>
-                <w:b w:val="0"/>
-                <w:i w:val="0"/>
-                <w:sz w:val="32"/>
-              </w:rPr>
-              <w:t>SB-00 AquaSense IoT - Firmware &amp; Hardware</w:t>
-            </w:r>
-          </w:p>
-        </w:tc>
-        <w:tc>
-          <w:tcPr>
-            <w:tcW w:type="dxa" w:w="2256"/>
-          </w:tcPr>
-          <w:p>
-            <w:r>
-              <w:rPr>
-                <w:rFonts w:ascii="TH Sarabun New" w:hAnsi="TH Sarabun New" w:eastAsia="TH Sarabun New" w:cs="TH Sarabun New"/>
-                <w:b w:val="0"/>
-                <w:i w:val="0"/>
-                <w:sz w:val="32"/>
-              </w:rPr>
-              <w:t>Version 1.1 | March 2026 | Confidential</w:t>
-            </w:r>
-          </w:p>
-        </w:tc>
-        <w:tc>
-          <w:tcPr>
-            <w:tcW w:type="dxa" w:w="2256"/>
-          </w:tcPr>
-          <w:p>
-            <w:r>
-              <w:rPr>
-                <w:rFonts w:ascii="TH Sarabun New" w:hAnsi="TH Sarabun New" w:eastAsia="TH Sarabun New" w:cs="TH Sarabun New"/>
-                <w:b w:val="0"/>
-                <w:i w:val="0"/>
-                <w:sz w:val="32"/>
-              </w:rPr>
-              <w:t>SB-00_Firmware_Hardware_v1_1.docx</w:t>
-            </w:r>
-          </w:p>
-        </w:tc>
-      </w:tr>
-      <w:tr>
-        <w:tc>
-          <w:tcPr>
-            <w:tcW w:type="dxa" w:w="2256"/>
-          </w:tcPr>
-          <w:p>
-            <w:r>
-              <w:rPr>
-                <w:rFonts w:ascii="TH Sarabun New" w:hAnsi="TH Sarabun New" w:eastAsia="TH Sarabun New" w:cs="TH Sarabun New"/>
-                <w:b w:val="0"/>
-                <w:i w:val="0"/>
-                <w:sz w:val="32"/>
-              </w:rPr>
-              <w:t>9</w:t>
-            </w:r>
-          </w:p>
-        </w:tc>
-        <w:tc>
-          <w:tcPr>
-            <w:tcW w:type="dxa" w:w="2256"/>
-          </w:tcPr>
-          <w:p>
-            <w:r>
-              <w:rPr>
-                <w:rFonts w:ascii="TH Sarabun New" w:hAnsi="TH Sarabun New" w:eastAsia="TH Sarabun New" w:cs="TH Sarabun New"/>
-                <w:b w:val="0"/>
-                <w:i w:val="0"/>
-                <w:sz w:val="32"/>
-              </w:rPr>
-              <w:t>SB-00 AquaSense IoT - รายการจัดซื้อ</w:t>
-            </w:r>
-          </w:p>
-        </w:tc>
-        <w:tc>
-          <w:tcPr>
-            <w:tcW w:type="dxa" w:w="2256"/>
-          </w:tcPr>
-          <w:p>
-            <w:r>
-              <w:rPr>
-                <w:rFonts w:ascii="TH Sarabun New" w:hAnsi="TH Sarabun New" w:eastAsia="TH Sarabun New" w:cs="TH Sarabun New"/>
-                <w:b w:val="0"/>
-                <w:i w:val="0"/>
-                <w:sz w:val="32"/>
-              </w:rPr>
-              <w:t>Version 1.1 | March 2026 | Confidential</w:t>
-            </w:r>
-          </w:p>
-        </w:tc>
-        <w:tc>
-          <w:tcPr>
-            <w:tcW w:type="dxa" w:w="2256"/>
-          </w:tcPr>
-          <w:p>
-            <w:r>
-              <w:rPr>
-                <w:rFonts w:ascii="TH Sarabun New" w:hAnsi="TH Sarabun New" w:eastAsia="TH Sarabun New" w:cs="TH Sarabun New"/>
-                <w:b w:val="0"/>
-                <w:i w:val="0"/>
-                <w:sz w:val="32"/>
-              </w:rPr>
-              <w:t>SB-00_Procurement_List_v1_1.docx</w:t>
-            </w:r>
-          </w:p>
-        </w:tc>
-      </w:tr>
-      <w:tr>
-        <w:tc>
-          <w:tcPr>
-            <w:tcW w:type="dxa" w:w="2256"/>
-          </w:tcPr>
-          <w:p>
-            <w:r>
-              <w:rPr>
-                <w:rFonts w:ascii="TH Sarabun New" w:hAnsi="TH Sarabun New" w:eastAsia="TH Sarabun New" w:cs="TH Sarabun New"/>
-                <w:b w:val="0"/>
-                <w:i w:val="0"/>
-                <w:sz w:val="32"/>
-              </w:rPr>
-              <w:t>10</w:t>
-            </w:r>
-          </w:p>
-        </w:tc>
-        <w:tc>
-          <w:tcPr>
-            <w:tcW w:type="dxa" w:w="2256"/>
-          </w:tcPr>
-          <w:p>
-            <w:r>
-              <w:rPr>
-                <w:rFonts w:ascii="TH Sarabun New" w:hAnsi="TH Sarabun New" w:eastAsia="TH Sarabun New" w:cs="TH Sarabun New"/>
-                <w:b w:val="0"/>
-                <w:i w:val="0"/>
-                <w:sz w:val="32"/>
-              </w:rPr>
-              <w:t>SB-00 - Battery Platform Interface Spec</w:t>
-            </w:r>
-          </w:p>
-        </w:tc>
-        <w:tc>
-          <w:tcPr>
-            <w:tcW w:type="dxa" w:w="2256"/>
-          </w:tcPr>
-          <w:p>
-            <w:r>
-              <w:rPr>
-                <w:rFonts w:ascii="TH Sarabun New" w:hAnsi="TH Sarabun New" w:eastAsia="TH Sarabun New" w:cs="TH Sarabun New"/>
-                <w:b w:val="0"/>
-                <w:i w:val="0"/>
-                <w:sz w:val="32"/>
-              </w:rPr>
-              <w:t>Version 1.0 | April 2026 | Working interface spec for EX-08A | Last synced: 2026-04-03</w:t>
-            </w:r>
-          </w:p>
-        </w:tc>
-        <w:tc>
-          <w:tcPr>
-            <w:tcW w:type="dxa" w:w="2256"/>
-          </w:tcPr>
-          <w:p>
-            <w:r>
-              <w:rPr>
-                <w:rFonts w:ascii="TH Sarabun New" w:hAnsi="TH Sarabun New" w:eastAsia="TH Sarabun New" w:cs="TH Sarabun New"/>
-                <w:b w:val="0"/>
-                <w:i w:val="0"/>
-                <w:sz w:val="32"/>
-              </w:rPr>
-              <w:t>SB-00_Battery_Platform_Interface_Spec_v1_0.docx</w:t>
+              <w:t>HB-05_Business_And_Launch_v1_0.docx</w:t>
             </w:r>
           </w:p>
         </w:tc>

</xml_diff>